<commit_message>
Tarea 26: nodos search y read_deep (busqueda en anchura, robustez, limites)
</commit_message>
<xml_diff>
--- a/descripcion_proyecto.docx
+++ b/descripcion_proyecto.docx
@@ -130,21 +130,7 @@
           <w:bCs w:val="false"/>
         </w:rPr>
         <w:tab/>
-        <w:t xml:space="preserve">1.- Buscar oportunidades (convocatorias </w:t>
-      </w:r>
-      <w:r>
-        <w:rPr>
-          <w:b w:val="false"/>
-          <w:bCs w:val="false"/>
-        </w:rPr>
-        <w:t>públicas o privadas</w:t>
-      </w:r>
-      <w:r>
-        <w:rPr>
-          <w:b w:val="false"/>
-          <w:bCs w:val="false"/>
-        </w:rPr>
-        <w:t>) para presentar proyectos.</w:t>
+        <w:t>1.- Buscar oportunidades (convocatorias públicas o privadas) para presentar proyectos.</w:t>
       </w:r>
     </w:p>
     <w:p>
@@ -182,28 +168,7 @@
           <w:bCs w:val="false"/>
         </w:rPr>
         <w:tab/>
-        <w:t xml:space="preserve">3.- Buscar modelos, plantillas, etc y ejemplos de proyectos que han sido aprobados para entrenar a la IA descargándolos </w:t>
-      </w:r>
-      <w:r>
-        <w:rPr>
-          <w:b w:val="false"/>
-          <w:bCs w:val="false"/>
-        </w:rPr>
-        <w:t>o</w:t>
-      </w:r>
-      <w:r>
-        <w:rPr>
-          <w:b w:val="false"/>
-          <w:bCs w:val="false"/>
-        </w:rPr>
-        <w:t xml:space="preserve"> haciendo un copia </w:t>
-      </w:r>
-      <w:r>
-        <w:rPr>
-          <w:b w:val="false"/>
-          <w:bCs w:val="false"/>
-        </w:rPr>
-        <w:t>local del documento/web si no es posible descargar.</w:t>
+        <w:t>3.- Buscar modelos, plantillas, etc y ejemplos de proyectos que han sido aprobados para entrenar a la IA descargándolos o haciendo un copia local del documento/web si no es posible descargar.</w:t>
       </w:r>
     </w:p>
     <w:p>
@@ -241,21 +206,7 @@
           <w:bCs w:val="false"/>
         </w:rPr>
         <w:tab/>
-        <w:t>5.- La redacción del proyecto deberá de ser íntegra, con gráficos, presentaciones y demás material audiovisual simple que sea necesario. Para ello se basará en los proyectos mejor cualificados que encuentre y que guardaremos en local. Responderá a: “</w:t>
-      </w:r>
-      <w:r>
-        <w:rPr>
-          <w:b w:val="false"/>
-          <w:bCs w:val="false"/>
-        </w:rPr>
-        <w:t xml:space="preserve">problemática-solución, </w:t>
-      </w:r>
-      <w:r>
-        <w:rPr>
-          <w:b w:val="false"/>
-          <w:bCs w:val="false"/>
-        </w:rPr>
-        <w:t>qué, cómo, cuándo, dónde, por qué, y costo”. Muy importante hacer la sección de presupuesto perfecta.</w:t>
+        <w:t>5.- La redacción del proyecto deberá de ser íntegra, con gráficos, presentaciones y demás material audiovisual simple que sea necesario. Para ello se basará en los proyectos mejor cualificados que encuentre y que guardaremos en local. Responderá a: “problemática-solución, qué, cómo, cuándo, dónde, por qué, y costo”. Muy importante hacer la sección de presupuesto perfecta.</w:t>
       </w:r>
     </w:p>
     <w:p>
@@ -352,110 +303,103 @@
           <w:bCs w:val="false"/>
         </w:rPr>
         <w:tab/>
-      </w:r>
-      <w:r>
-        <w:rPr>
-          <w:b w:val="false"/>
-          <w:bCs w:val="false"/>
-        </w:rPr>
-        <w:t xml:space="preserve">8.- Tendrá una interfaz para el usuario tipo web, </w:t>
-      </w:r>
-      <w:r>
-        <w:rPr>
-          <w:b w:val="false"/>
-          <w:bCs w:val="false"/>
-        </w:rPr>
-        <w:t>la programación será</w:t>
-      </w:r>
-      <w:r>
-        <w:rPr>
-          <w:b w:val="false"/>
-          <w:bCs w:val="false"/>
-        </w:rPr>
-        <w:t xml:space="preserve"> en Python. </w:t>
-      </w:r>
-      <w:r>
-        <w:rPr>
-          <w:b w:val="false"/>
-          <w:bCs w:val="false"/>
-        </w:rPr>
-        <w:t>Con la interfaz el u</w:t>
-      </w:r>
-      <w:r>
-        <w:rPr>
-          <w:b w:val="false"/>
-          <w:bCs w:val="false"/>
-        </w:rPr>
-        <w:t xml:space="preserve">suario podrá subir </w:t>
-      </w:r>
-      <w:r>
-        <w:rPr>
-          <w:b w:val="false"/>
-          <w:bCs w:val="false"/>
-        </w:rPr>
-        <w:t>recursos para</w:t>
-      </w:r>
-      <w:r>
-        <w:rPr>
-          <w:b w:val="false"/>
-          <w:bCs w:val="false"/>
-        </w:rPr>
-        <w:t xml:space="preserve"> sus proyectos </w:t>
-      </w:r>
-      <w:r>
-        <w:rPr>
-          <w:b w:val="false"/>
-          <w:bCs w:val="false"/>
-        </w:rPr>
-        <w:t>(que se guardarán en ‘RECURSOS\[nombre_proyecto]\’</w:t>
-      </w:r>
-      <w:r>
-        <w:rPr>
-          <w:b w:val="false"/>
-          <w:bCs w:val="false"/>
-        </w:rPr>
-        <w:t xml:space="preserve">, solicitar acciones a la IA (‘redacta el proyecto X para presentar a </w:t>
-      </w:r>
-      <w:r>
-        <w:rPr>
-          <w:b w:val="false"/>
-          <w:bCs w:val="false"/>
-        </w:rPr>
-        <w:t>la convocatoria/institución Y’, ‘hazme un resumen de los proyectos que tenemos y su estado’, etc), visualizar las respuestas de la IA, poder descargar las respuestas de la IA en archivos de diferentes formatos (pdf, presentación, docx, etc)</w:t>
-      </w:r>
-    </w:p>
-    <w:p>
-      <w:pPr>
-        <w:pStyle w:val="Normal"/>
-        <w:bidi w:val="0"/>
-        <w:jc w:val="start"/>
-        <w:rPr>
-          <w:b w:val="false"/>
-          <w:bCs w:val="false"/>
-        </w:rPr>
-      </w:pPr>
-      <w:r>
-        <w:rPr>
-          <w:b w:val="false"/>
-          <w:bCs w:val="false"/>
-        </w:rPr>
-      </w:r>
-    </w:p>
-    <w:p>
-      <w:pPr>
-        <w:pStyle w:val="Normal"/>
-        <w:bidi w:val="0"/>
-        <w:jc w:val="start"/>
-        <w:rPr>
-          <w:b w:val="false"/>
-          <w:bCs w:val="false"/>
-        </w:rPr>
-      </w:pPr>
-      <w:r>
-        <w:rPr>
-          <w:b w:val="false"/>
-          <w:bCs w:val="false"/>
-        </w:rPr>
+        <w:t>8.- Tendrá una interfaz para el usuario tipo web, la programación será en Python. Con la interfaz el usuario podrá subir recursos para sus proyectos (que se guardarán en ‘RECURSOS\[nombre_proyecto]\’, solicitar acciones a la IA (‘redacta el proyecto X para presentar a la convocatoria/institución Y’, ‘hazme un resumen de los proyectos que tenemos y su estado’, etc), visualizar las respuestas de la IA, poder descargar las respuestas de la IA en archivos de diferentes formatos (pdf, presentación, docx, etc)</w:t>
+      </w:r>
+    </w:p>
+    <w:p>
+      <w:pPr>
+        <w:pStyle w:val="Normal"/>
+        <w:bidi w:val="0"/>
+        <w:jc w:val="start"/>
+        <w:rPr>
+          <w:b w:val="false"/>
+          <w:bCs w:val="false"/>
+        </w:rPr>
+      </w:pPr>
+      <w:r>
+        <w:rPr>
+          <w:b w:val="false"/>
+          <w:bCs w:val="false"/>
+        </w:rPr>
+      </w:r>
+    </w:p>
+    <w:p>
+      <w:pPr>
+        <w:pStyle w:val="Normal"/>
+        <w:bidi w:val="0"/>
+        <w:jc w:val="start"/>
+        <w:rPr>
+          <w:b w:val="false"/>
+          <w:bCs w:val="false"/>
+        </w:rPr>
+      </w:pPr>
+      <w:r>
+        <w:rPr>
+          <w:b w:val="false"/>
+          <w:bCs w:val="false"/>
+        </w:rPr>
+        <w:t>3 junio 2026:</w:t>
+      </w:r>
+    </w:p>
+    <w:p>
+      <w:pPr>
+        <w:pStyle w:val="Normal"/>
+        <w:bidi w:val="0"/>
+        <w:jc w:val="start"/>
+        <w:rPr>
+          <w:b w:val="false"/>
+          <w:bCs w:val="false"/>
+        </w:rPr>
+      </w:pPr>
+      <w:r>
+        <w:rPr>
+          <w:b w:val="false"/>
+          <w:bCs w:val="false"/>
+        </w:rPr>
+      </w:r>
+    </w:p>
+    <w:p>
+      <w:pPr>
+        <w:pStyle w:val="Normal"/>
+        <w:numPr>
+          <w:ilvl w:val="0"/>
+          <w:numId w:val="2"/>
+        </w:numPr>
+        <w:bidi w:val="0"/>
+        <w:jc w:val="start"/>
+        <w:rPr>
+          <w:b w:val="false"/>
+          <w:bCs w:val="false"/>
+        </w:rPr>
+      </w:pPr>
+      <w:r>
+        <w:rPr>
+          <w:b w:val="false"/>
+          <w:bCs w:val="false"/>
+        </w:rPr>
+        <w:t>se debe de poder elegir la profundidad de la búsqueda (n.º de páginas visitadas en un búsqueda)</w:t>
+      </w:r>
+    </w:p>
+    <w:p>
+      <w:pPr>
+        <w:pStyle w:val="Normal"/>
+        <w:numPr>
+          <w:ilvl w:val="0"/>
+          <w:numId w:val="2"/>
+        </w:numPr>
+        <w:bidi w:val="0"/>
+        <w:jc w:val="start"/>
+        <w:rPr>
+          <w:b w:val="false"/>
+          <w:bCs w:val="false"/>
+        </w:rPr>
+      </w:pPr>
+      <w:r>
+        <w:rPr>
+          <w:b w:val="false"/>
+          <w:bCs w:val="false"/>
+        </w:rPr>
+        <w:t>debes de poder darle una fuente en concreto para que investigue (en prompt, en un campo o en ambos?)</w:t>
       </w:r>
     </w:p>
     <w:p>
@@ -2124,6 +2068,7 @@
       <w:pgNumType w:fmt="decimal"/>
       <w:formProt w:val="false"/>
       <w:textDirection w:val="lrTb"/>
+      <w:docGrid w:type="default" w:linePitch="100" w:charSpace="0"/>
     </w:sectPr>
   </w:body>
 </w:document>
@@ -2271,6 +2216,143 @@
   <w:abstractNum w:abstractNumId="2">
     <w:lvl w:ilvl="0">
       <w:start w:val="1"/>
+      <w:numFmt w:val="bullet"/>
+      <w:lvlText w:val=""/>
+      <w:lvlJc w:val="start"/>
+      <w:pPr>
+        <w:tabs>
+          <w:tab w:val="num" w:pos="1429"/>
+        </w:tabs>
+        <w:ind w:start="1429" w:hanging="360"/>
+      </w:pPr>
+      <w:rPr>
+        <w:rFonts w:ascii="Symbol" w:hAnsi="Symbol" w:cs="Symbol" w:hint="default"/>
+      </w:rPr>
+    </w:lvl>
+    <w:lvl w:ilvl="1">
+      <w:start w:val="1"/>
+      <w:numFmt w:val="bullet"/>
+      <w:lvlText w:val="◦"/>
+      <w:lvlJc w:val="start"/>
+      <w:pPr>
+        <w:tabs>
+          <w:tab w:val="num" w:pos="1789"/>
+        </w:tabs>
+        <w:ind w:start="1789" w:hanging="360"/>
+      </w:pPr>
+      <w:rPr>
+        <w:rFonts w:ascii="OpenSymbol" w:hAnsi="OpenSymbol" w:cs="OpenSymbol" w:hint="default"/>
+      </w:rPr>
+    </w:lvl>
+    <w:lvl w:ilvl="2">
+      <w:start w:val="1"/>
+      <w:numFmt w:val="bullet"/>
+      <w:lvlText w:val="▪"/>
+      <w:lvlJc w:val="start"/>
+      <w:pPr>
+        <w:tabs>
+          <w:tab w:val="num" w:pos="2149"/>
+        </w:tabs>
+        <w:ind w:start="2149" w:hanging="360"/>
+      </w:pPr>
+      <w:rPr>
+        <w:rFonts w:ascii="OpenSymbol" w:hAnsi="OpenSymbol" w:cs="OpenSymbol" w:hint="default"/>
+      </w:rPr>
+    </w:lvl>
+    <w:lvl w:ilvl="3">
+      <w:start w:val="1"/>
+      <w:numFmt w:val="bullet"/>
+      <w:lvlText w:val=""/>
+      <w:lvlJc w:val="start"/>
+      <w:pPr>
+        <w:tabs>
+          <w:tab w:val="num" w:pos="2509"/>
+        </w:tabs>
+        <w:ind w:start="2509" w:hanging="360"/>
+      </w:pPr>
+      <w:rPr>
+        <w:rFonts w:ascii="Symbol" w:hAnsi="Symbol" w:cs="Symbol" w:hint="default"/>
+      </w:rPr>
+    </w:lvl>
+    <w:lvl w:ilvl="4">
+      <w:start w:val="1"/>
+      <w:numFmt w:val="bullet"/>
+      <w:lvlText w:val="◦"/>
+      <w:lvlJc w:val="start"/>
+      <w:pPr>
+        <w:tabs>
+          <w:tab w:val="num" w:pos="2869"/>
+        </w:tabs>
+        <w:ind w:start="2869" w:hanging="360"/>
+      </w:pPr>
+      <w:rPr>
+        <w:rFonts w:ascii="OpenSymbol" w:hAnsi="OpenSymbol" w:cs="OpenSymbol" w:hint="default"/>
+      </w:rPr>
+    </w:lvl>
+    <w:lvl w:ilvl="5">
+      <w:start w:val="1"/>
+      <w:numFmt w:val="bullet"/>
+      <w:lvlText w:val="▪"/>
+      <w:lvlJc w:val="start"/>
+      <w:pPr>
+        <w:tabs>
+          <w:tab w:val="num" w:pos="3229"/>
+        </w:tabs>
+        <w:ind w:start="3229" w:hanging="360"/>
+      </w:pPr>
+      <w:rPr>
+        <w:rFonts w:ascii="OpenSymbol" w:hAnsi="OpenSymbol" w:cs="OpenSymbol" w:hint="default"/>
+      </w:rPr>
+    </w:lvl>
+    <w:lvl w:ilvl="6">
+      <w:start w:val="1"/>
+      <w:numFmt w:val="bullet"/>
+      <w:lvlText w:val=""/>
+      <w:lvlJc w:val="start"/>
+      <w:pPr>
+        <w:tabs>
+          <w:tab w:val="num" w:pos="3589"/>
+        </w:tabs>
+        <w:ind w:start="3589" w:hanging="360"/>
+      </w:pPr>
+      <w:rPr>
+        <w:rFonts w:ascii="Symbol" w:hAnsi="Symbol" w:cs="Symbol" w:hint="default"/>
+      </w:rPr>
+    </w:lvl>
+    <w:lvl w:ilvl="7">
+      <w:start w:val="1"/>
+      <w:numFmt w:val="bullet"/>
+      <w:lvlText w:val="◦"/>
+      <w:lvlJc w:val="start"/>
+      <w:pPr>
+        <w:tabs>
+          <w:tab w:val="num" w:pos="3949"/>
+        </w:tabs>
+        <w:ind w:start="3949" w:hanging="360"/>
+      </w:pPr>
+      <w:rPr>
+        <w:rFonts w:ascii="OpenSymbol" w:hAnsi="OpenSymbol" w:cs="OpenSymbol" w:hint="default"/>
+      </w:rPr>
+    </w:lvl>
+    <w:lvl w:ilvl="8">
+      <w:start w:val="1"/>
+      <w:numFmt w:val="bullet"/>
+      <w:lvlText w:val="▪"/>
+      <w:lvlJc w:val="start"/>
+      <w:pPr>
+        <w:tabs>
+          <w:tab w:val="num" w:pos="4309"/>
+        </w:tabs>
+        <w:ind w:start="4309" w:hanging="360"/>
+      </w:pPr>
+      <w:rPr>
+        <w:rFonts w:ascii="OpenSymbol" w:hAnsi="OpenSymbol" w:cs="OpenSymbol" w:hint="default"/>
+      </w:rPr>
+    </w:lvl>
+  </w:abstractNum>
+  <w:abstractNum w:abstractNumId="3">
+    <w:lvl w:ilvl="0">
+      <w:start w:val="1"/>
       <w:numFmt w:val="none"/>
       <w:suff w:val="nothing"/>
       <w:lvlText w:val=""/>
@@ -2392,6 +2474,9 @@
   </w:num>
   <w:num w:numId="2">
     <w:abstractNumId w:val="2"/>
+  </w:num>
+  <w:num w:numId="3">
+    <w:abstractNumId w:val="3"/>
   </w:num>
 </w:numbering>
 </file>
@@ -2410,7 +2495,6 @@
     </w:rPrDefault>
     <w:pPrDefault>
       <w:pPr>
-        <w:widowControl/>
         <w:suppressAutoHyphens w:val="true"/>
       </w:pPr>
     </w:pPrDefault>
@@ -2420,7 +2504,10 @@
     <w:qFormat/>
     <w:pPr>
       <w:widowControl/>
+      <w:suppressAutoHyphens w:val="true"/>
       <w:bidi w:val="0"/>
+      <w:spacing w:before="0" w:after="0"/>
+      <w:jc w:val="start"/>
     </w:pPr>
     <w:rPr>
       <w:rFonts w:ascii="Liberation Serif" w:hAnsi="Liberation Serif" w:eastAsia="NSimSun" w:cs="Lucida Sans"/>
@@ -2429,6 +2516,13 @@
       <w:sz w:val="24"/>
       <w:szCs w:val="24"/>
       <w:lang w:val="es-ES" w:eastAsia="zh-CN" w:bidi="hi-IN"/>
+    </w:rPr>
+  </w:style>
+  <w:style w:type="character" w:styleId="Bolosuser">
+    <w:name w:val="Bolos (user)"/>
+    <w:qFormat/>
+    <w:rPr>
+      <w:rFonts w:ascii="OpenSymbol" w:hAnsi="OpenSymbol" w:eastAsia="OpenSymbol" w:cs="OpenSymbol"/>
     </w:rPr>
   </w:style>
   <w:style w:type="character" w:styleId="Bolos">
@@ -2487,6 +2581,32 @@
   </w:style>
   <w:style w:type="paragraph" w:styleId="ndice">
     <w:name w:val="Índice"/>
+    <w:basedOn w:val="Normal"/>
+    <w:qFormat/>
+    <w:pPr>
+      <w:suppressLineNumbers/>
+    </w:pPr>
+    <w:rPr>
+      <w:rFonts w:cs="Lucida Sans"/>
+    </w:rPr>
+  </w:style>
+  <w:style w:type="paragraph" w:styleId="Ttulouser">
+    <w:name w:val="Título (user)"/>
+    <w:basedOn w:val="Normal"/>
+    <w:next w:val="BodyText"/>
+    <w:qFormat/>
+    <w:pPr>
+      <w:keepNext w:val="true"/>
+      <w:spacing w:before="240" w:after="120"/>
+    </w:pPr>
+    <w:rPr>
+      <w:rFonts w:ascii="Liberation Sans" w:hAnsi="Liberation Sans" w:eastAsia="Microsoft YaHei" w:cs="Lucida Sans"/>
+      <w:sz w:val="28"/>
+      <w:szCs w:val="28"/>
+    </w:rPr>
+  </w:style>
+  <w:style w:type="paragraph" w:styleId="ndiceuser">
+    <w:name w:val="Índice (user)"/>
     <w:basedOn w:val="Normal"/>
     <w:qFormat/>
     <w:pPr>

</xml_diff>